<commit_message>
feat(spec): finalize v3.1.0 commercial baseline with multi-defender crypto, 352h WBS, and verified CVSS suite
- Architecture: Bounded Program-Scoped Multi-Defender Model (N <= 10) with recipient_set_version concurrency guard and dual-lane payload isolation
- Cryptography: Historical-access isolation (explicitly distinguishing from forward secrecy) with audited browser-side session key re-wrapping
- WBS & Workload: Expanded commercial work packages (WP-7.1 to WP-7.9) to 88h; unified 352h total across 8 Sprints with dynamic Excel SUM formulas
- CVSS Suite: Restructured to 45 mathematically unique vectors (30 real-world NVD CVEs + 15 boundaries); corrected CVE-2021-41773 and FIRST.org Examples citation
- Verification: Built verify_cvss_engine.py (100% calculation parity) and lint_all_specifications.py (67/67 passing checks)
- Deliverables: Synchronized and recompiled BRD.docx, SRS.docx (6 embedded diagrams), and WBS.xlsx across requirements/ and Resources/
</commit_message>
<xml_diff>
--- a/requirements/BRD.docx
+++ b/requirements/BRD.docx
@@ -5161,7 +5161,7 @@
           <w:color w:val="222222"/>
           <w:sz w:val="20"/>
         </w:rPr>
-        <w:t xml:space="preserve">: The platform shall enforce storage quotas of 50 MB database volume on PostgreSQL and 2 GB encrypted object storage on Cloudflare R2 per tenant organization (bounding total multi-tenant demo volume across 5 tenants within 250 MB database and 10 GB object storage limits). The platform shall issue an administrative warning when organization storage usage reaches 90% of the configured quota, and strictly reject any new upload or report allocation that would cause total storage to exceed 100% (HTTP 413 Payload Too Large).</w:t>
+        <w:t xml:space="preserve">: The platform shall enforce storage quotas to protect shared infrastructure: in the academic demonstration baseline, quotas are configured at 50 MB database volume on PostgreSQL and 2 GB encrypted object storage on Cloudflare R2 per tenant organization (bounding total multi-tenant demo volume across 5 tenants within 250 MB database and 10 GB object storage limits). In commercial production, per-tenant quotas correspond to subscription tier entitlements (10 GB for Starter, 50 GB for Team/Pro). The platform shall issue an administrative warning when organization storage usage reaches 90% of the configured quota, and strictly reject any new upload or report allocation that would cause total storage to exceed 100% (HTTP 413 Payload Too Large).</w:t>
       </w:r>
     </w:p>
     <w:p xmlns:w="http://schemas.openxmlformats.org/wordprocessingml/2006/main">
@@ -6511,7 +6511,7 @@
           <w:color w:val="2B4C1A"/>
           <w:sz w:val="22"/>
         </w:rPr>
-        <w:t xml:space="preserve">8.2 Commercial Production Cloud Budget (Early Commercial Cohort: 10 Tenants)</w:t>
+        <w:t xml:space="preserve">8.2 Commercial Production Cloud Budget (Early Commercial Cohort: 10–25 Tenants)</w:t>
       </w:r>
     </w:p>
     <w:p xmlns:w="http://schemas.openxmlformats.org/wordprocessingml/2006/main">
@@ -6542,11 +6542,11 @@
         </w:tblBorders>
       </w:tblPr>
       <w:tblGrid>
-        <w:gridCol w:w="2164"/>
+        <w:gridCol w:w="2176"/>
         <w:gridCol w:w="1200"/>
-        <w:gridCol w:w="1554"/>
-        <w:gridCol w:w="3774"/>
-        <w:gridCol w:w="1244"/>
+        <w:gridCol w:w="1674"/>
+        <w:gridCol w:w="3851"/>
+        <w:gridCol w:w="1200"/>
       </w:tblGrid>
       <w:tr>
         <w:trPr>
@@ -6554,7 +6554,7 @@
         </w:trPr>
         <w:tc>
           <w:tcPr>
-            <w:tcW w:w="2164" w:type="dxa"/>
+            <w:tcW w:w="2176" w:type="dxa"/>
             <w:shd w:val="clear" w:fill="E3EFCB"/>
             <w:tcMar>
               <w:top w:w="80" w:type="dxa"/>
@@ -6608,7 +6608,7 @@
         </w:tc>
         <w:tc>
           <w:tcPr>
-            <w:tcW w:w="1554" w:type="dxa"/>
+            <w:tcW w:w="1674" w:type="dxa"/>
             <w:shd w:val="clear" w:fill="E3EFCB"/>
             <w:tcMar>
               <w:top w:w="80" w:type="dxa"/>
@@ -6635,7 +6635,7 @@
         </w:tc>
         <w:tc>
           <w:tcPr>
-            <w:tcW w:w="3774" w:type="dxa"/>
+            <w:tcW w:w="3851" w:type="dxa"/>
             <w:shd w:val="clear" w:fill="E3EFCB"/>
             <w:tcMar>
               <w:top w:w="80" w:type="dxa"/>
@@ -6662,7 +6662,7 @@
         </w:tc>
         <w:tc>
           <w:tcPr>
-            <w:tcW w:w="1244" w:type="dxa"/>
+            <w:tcW w:w="1200" w:type="dxa"/>
             <w:shd w:val="clear" w:fill="E3EFCB"/>
             <w:tcMar>
               <w:top w:w="80" w:type="dxa"/>
@@ -6691,7 +6691,7 @@
       <w:tr>
         <w:tc>
           <w:tcPr>
-            <w:tcW w:w="2164" w:type="dxa"/>
+            <w:tcW w:w="2176" w:type="dxa"/>
             <w:tcMar>
               <w:top w:w="60" w:type="dxa"/>
               <w:bottom w:w="60" w:type="dxa"/>
@@ -6742,7 +6742,7 @@
         </w:tc>
         <w:tc>
           <w:tcPr>
-            <w:tcW w:w="1554" w:type="dxa"/>
+            <w:tcW w:w="1674" w:type="dxa"/>
             <w:tcMar>
               <w:top w:w="60" w:type="dxa"/>
               <w:bottom w:w="60" w:type="dxa"/>
@@ -6767,7 +6767,7 @@
         </w:tc>
         <w:tc>
           <w:tcPr>
-            <w:tcW w:w="3774" w:type="dxa"/>
+            <w:tcW w:w="3851" w:type="dxa"/>
             <w:tcMar>
               <w:top w:w="60" w:type="dxa"/>
               <w:bottom w:w="60" w:type="dxa"/>
@@ -6792,7 +6792,7 @@
         </w:tc>
         <w:tc>
           <w:tcPr>
-            <w:tcW w:w="1244" w:type="dxa"/>
+            <w:tcW w:w="1200" w:type="dxa"/>
             <w:tcMar>
               <w:top w:w="60" w:type="dxa"/>
               <w:bottom w:w="60" w:type="dxa"/>
@@ -6820,7 +6820,7 @@
       <w:tr>
         <w:tc>
           <w:tcPr>
-            <w:tcW w:w="2164" w:type="dxa"/>
+            <w:tcW w:w="2176" w:type="dxa"/>
             <w:shd w:val="clear" w:fill="F9FBF6"/>
             <w:tcMar>
               <w:top w:w="60" w:type="dxa"/>
@@ -6873,7 +6873,7 @@
         </w:tc>
         <w:tc>
           <w:tcPr>
-            <w:tcW w:w="1554" w:type="dxa"/>
+            <w:tcW w:w="1674" w:type="dxa"/>
             <w:shd w:val="clear" w:fill="F9FBF6"/>
             <w:tcMar>
               <w:top w:w="60" w:type="dxa"/>
@@ -6899,7 +6899,7 @@
         </w:tc>
         <w:tc>
           <w:tcPr>
-            <w:tcW w:w="3774" w:type="dxa"/>
+            <w:tcW w:w="3851" w:type="dxa"/>
             <w:shd w:val="clear" w:fill="F9FBF6"/>
             <w:tcMar>
               <w:top w:w="60" w:type="dxa"/>
@@ -6925,7 +6925,7 @@
         </w:tc>
         <w:tc>
           <w:tcPr>
-            <w:tcW w:w="1244" w:type="dxa"/>
+            <w:tcW w:w="1200" w:type="dxa"/>
             <w:shd w:val="clear" w:fill="F9FBF6"/>
             <w:tcMar>
               <w:top w:w="60" w:type="dxa"/>
@@ -6954,7 +6954,7 @@
       <w:tr>
         <w:tc>
           <w:tcPr>
-            <w:tcW w:w="2164" w:type="dxa"/>
+            <w:tcW w:w="2176" w:type="dxa"/>
             <w:tcMar>
               <w:top w:w="60" w:type="dxa"/>
               <w:bottom w:w="60" w:type="dxa"/>
@@ -7005,7 +7005,7 @@
         </w:tc>
         <w:tc>
           <w:tcPr>
-            <w:tcW w:w="1554" w:type="dxa"/>
+            <w:tcW w:w="1674" w:type="dxa"/>
             <w:tcMar>
               <w:top w:w="60" w:type="dxa"/>
               <w:bottom w:w="60" w:type="dxa"/>
@@ -7030,7 +7030,7 @@
         </w:tc>
         <w:tc>
           <w:tcPr>
-            <w:tcW w:w="3774" w:type="dxa"/>
+            <w:tcW w:w="3851" w:type="dxa"/>
             <w:tcMar>
               <w:top w:w="60" w:type="dxa"/>
               <w:bottom w:w="60" w:type="dxa"/>
@@ -7049,13 +7049,13 @@
                 <w:color w:val="222222"/>
                 <w:sz w:val="18"/>
               </w:rPr>
-              <w:t xml:space="preserve">Encrypted report attachments, 50 GB baseline, zero egress fees</w:t>
+              <w:t xml:space="preserve">Encrypted report attachments, 50 GB pooled baseline, zero egress fees</w:t>
             </w:r>
           </w:p>
         </w:tc>
         <w:tc>
           <w:tcPr>
-            <w:tcW w:w="1244" w:type="dxa"/>
+            <w:tcW w:w="1200" w:type="dxa"/>
             <w:tcMar>
               <w:top w:w="60" w:type="dxa"/>
               <w:bottom w:w="60" w:type="dxa"/>
@@ -7075,7 +7075,7 @@
                 <w:color w:val="222222"/>
                 <w:sz w:val="18"/>
               </w:rPr>
-              <w:t xml:space="preserve">$1.00</w:t>
+              <w:t xml:space="preserve">$0.75</w:t>
             </w:r>
           </w:p>
         </w:tc>
@@ -7083,7 +7083,7 @@
       <w:tr>
         <w:tc>
           <w:tcPr>
-            <w:tcW w:w="2164" w:type="dxa"/>
+            <w:tcW w:w="2176" w:type="dxa"/>
             <w:shd w:val="clear" w:fill="F9FBF6"/>
             <w:tcMar>
               <w:top w:w="60" w:type="dxa"/>
@@ -7136,7 +7136,7 @@
         </w:tc>
         <w:tc>
           <w:tcPr>
-            <w:tcW w:w="1554" w:type="dxa"/>
+            <w:tcW w:w="1674" w:type="dxa"/>
             <w:shd w:val="clear" w:fill="F9FBF6"/>
             <w:tcMar>
               <w:top w:w="60" w:type="dxa"/>
@@ -7162,7 +7162,7 @@
         </w:tc>
         <w:tc>
           <w:tcPr>
-            <w:tcW w:w="3774" w:type="dxa"/>
+            <w:tcW w:w="3851" w:type="dxa"/>
             <w:shd w:val="clear" w:fill="F9FBF6"/>
             <w:tcMar>
               <w:top w:w="60" w:type="dxa"/>
@@ -7182,13 +7182,13 @@
                 <w:color w:val="222222"/>
                 <w:sz w:val="18"/>
               </w:rPr>
-              <w:t xml:space="preserve">High deliverability transactional metadata notifications (50,000/mo)</w:t>
+              <w:t xml:space="preserve">High deliverability minimal-metadata notifications (50,000/mo)</w:t>
             </w:r>
           </w:p>
         </w:tc>
         <w:tc>
           <w:tcPr>
-            <w:tcW w:w="1244" w:type="dxa"/>
+            <w:tcW w:w="1200" w:type="dxa"/>
             <w:shd w:val="clear" w:fill="F9FBF6"/>
             <w:tcMar>
               <w:top w:w="60" w:type="dxa"/>
@@ -7217,7 +7217,7 @@
       <w:tr>
         <w:tc>
           <w:tcPr>
-            <w:tcW w:w="2164" w:type="dxa"/>
+            <w:tcW w:w="2176" w:type="dxa"/>
             <w:tcMar>
               <w:top w:w="60" w:type="dxa"/>
               <w:bottom w:w="60" w:type="dxa"/>
@@ -7237,7 +7237,7 @@
                 <w:color w:val="222222"/>
                 <w:sz w:val="18"/>
               </w:rPr>
-              <w:t xml:space="preserve">Error &amp; Performance Monitoring</w:t>
+              <w:t xml:space="preserve">Domain &amp; DNS Registration</w:t>
             </w:r>
           </w:p>
         </w:tc>
@@ -7262,13 +7262,62 @@
                 <w:color w:val="222222"/>
                 <w:sz w:val="18"/>
               </w:rPr>
-              <w:t xml:space="preserve">Sentry Cloud</w:t>
+              <w:t xml:space="preserve">Cloudflare Registrar</w:t>
             </w:r>
           </w:p>
         </w:tc>
         <w:tc>
           <w:tcPr>
-            <w:tcW w:w="1554" w:type="dxa"/>
+            <w:tcW w:w="1674" w:type="dxa"/>
+            <w:tcMar>
+              <w:top w:w="60" w:type="dxa"/>
+              <w:bottom w:w="60" w:type="dxa"/>
+              <w:left w:w="120" w:type="dxa"/>
+              <w:right w:w="120" w:type="dxa"/>
+            </w:tcMar>
+          </w:tcPr>
+          <w:p xmlns:w="http://schemas.openxmlformats.org/wordprocessingml/2006/main">
+            <w:pPr>
+              <w:spacing w:before="30" w:after="30"/>
+              <w:jc w:val="left"/>
+            </w:pPr>
+            <w:r>
+              <w:rPr>
+                <w:rFonts w:ascii="Consolas" w:hAnsi="Consolas"/>
+                <w:color w:val="9C4146"/>
+                <w:sz w:val="18"/>
+              </w:rPr>
+              <w:t xml:space="preserve">.com</w:t>
+            </w:r>
+            <w:r>
+              <w:rPr>
+                <w:rFonts w:ascii="Lexend" w:hAnsi="Lexend"/>
+                <w:color w:val="222222"/>
+                <w:sz w:val="18"/>
+              </w:rPr>
+              <w:t xml:space="preserve"> / </w:t>
+            </w:r>
+            <w:r>
+              <w:rPr>
+                <w:rFonts w:ascii="Consolas" w:hAnsi="Consolas"/>
+                <w:color w:val="9C4146"/>
+                <w:sz w:val="18"/>
+              </w:rPr>
+              <w:t xml:space="preserve">.security</w:t>
+            </w:r>
+            <w:r>
+              <w:rPr>
+                <w:rFonts w:ascii="Lexend" w:hAnsi="Lexend"/>
+                <w:color w:val="222222"/>
+                <w:sz w:val="18"/>
+              </w:rPr>
+              <w:t xml:space="preserve"> TLD</w:t>
+            </w:r>
+          </w:p>
+        </w:tc>
+        <w:tc>
+          <w:tcPr>
+            <w:tcW w:w="3851" w:type="dxa"/>
             <w:tcMar>
               <w:top w:w="60" w:type="dxa"/>
               <w:bottom w:w="60" w:type="dxa"/>
@@ -7287,38 +7336,13 @@
                 <w:color w:val="222222"/>
                 <w:sz w:val="18"/>
               </w:rPr>
-              <w:t xml:space="preserve">Team Tier Baseline</w:t>
+              <w:t xml:space="preserve">Amortized domain registrar fee ($15.00/year)</w:t>
             </w:r>
           </w:p>
         </w:tc>
         <w:tc>
           <w:tcPr>
-            <w:tcW w:w="3774" w:type="dxa"/>
-            <w:tcMar>
-              <w:top w:w="60" w:type="dxa"/>
-              <w:bottom w:w="60" w:type="dxa"/>
-              <w:left w:w="120" w:type="dxa"/>
-              <w:right w:w="120" w:type="dxa"/>
-            </w:tcMar>
-          </w:tcPr>
-          <w:p xmlns:w="http://schemas.openxmlformats.org/wordprocessingml/2006/main">
-            <w:pPr>
-              <w:spacing w:before="30" w:after="30"/>
-              <w:jc w:val="left"/>
-            </w:pPr>
-            <w:r>
-              <w:rPr>
-                <w:rFonts w:ascii="Lexend" w:hAnsi="Lexend"/>
-                <w:color w:val="222222"/>
-                <w:sz w:val="18"/>
-              </w:rPr>
-              <w:t xml:space="preserve">Real-time frontend exception and performance tracing</w:t>
-            </w:r>
-          </w:p>
-        </w:tc>
-        <w:tc>
-          <w:tcPr>
-            <w:tcW w:w="1244" w:type="dxa"/>
+            <w:tcW w:w="1200" w:type="dxa"/>
             <w:tcMar>
               <w:top w:w="60" w:type="dxa"/>
               <w:bottom w:w="60" w:type="dxa"/>
@@ -7338,24 +7362,7 @@
                 <w:color w:val="222222"/>
                 <w:sz w:val="18"/>
               </w:rPr>
-              <w:t xml:space="preserve">$0.00</w:t>
-            </w:r>
-            <w:r>
-              <w:rPr>
-                <w:rFonts w:ascii="Lexend" w:hAnsi="Lexend"/>
-                <w:color w:val="222222"/>
-                <w:sz w:val="18"/>
-              </w:rPr>
-              <w:t xml:space="preserve"> </w:t>
-            </w:r>
-            <w:r>
-              <w:rPr>
-                <w:rFonts w:ascii="Lexend" w:hAnsi="Lexend"/>
-                <w:i/>
-                <w:color w:val="222222"/>
-                <w:sz w:val="18"/>
-              </w:rPr>
-              <w:t xml:space="preserve">(Developer)</w:t>
+              <w:t xml:space="preserve">$1.25</w:t>
             </w:r>
           </w:p>
         </w:tc>
@@ -7363,7 +7370,7 @@
       <w:tr>
         <w:tc>
           <w:tcPr>
-            <w:tcW w:w="2164" w:type="dxa"/>
+            <w:tcW w:w="2176" w:type="dxa"/>
             <w:shd w:val="clear" w:fill="F9FBF6"/>
             <w:tcMar>
               <w:top w:w="60" w:type="dxa"/>
@@ -7384,7 +7391,7 @@
                 <w:color w:val="222222"/>
                 <w:sz w:val="18"/>
               </w:rPr>
-              <w:t xml:space="preserve">DNS &amp; Custom Domains</w:t>
+              <w:t xml:space="preserve">Payment Gateway</w:t>
             </w:r>
           </w:p>
         </w:tc>
@@ -7410,13 +7417,13 @@
                 <w:color w:val="222222"/>
                 <w:sz w:val="18"/>
               </w:rPr>
-              <w:t xml:space="preserve">Cloudflare DNS</w:t>
+              <w:t xml:space="preserve">Stripe Billing</w:t>
             </w:r>
           </w:p>
         </w:tc>
         <w:tc>
           <w:tcPr>
-            <w:tcW w:w="1554" w:type="dxa"/>
+            <w:tcW w:w="1674" w:type="dxa"/>
             <w:shd w:val="clear" w:fill="F9FBF6"/>
             <w:tcMar>
               <w:top w:w="60" w:type="dxa"/>
@@ -7436,13 +7443,13 @@
                 <w:color w:val="222222"/>
                 <w:sz w:val="18"/>
               </w:rPr>
-              <w:t xml:space="preserve">Free Commercial Tier</w:t>
+              <w:t xml:space="preserve">Automated invoicing &amp; checkout</w:t>
             </w:r>
           </w:p>
         </w:tc>
         <w:tc>
           <w:tcPr>
-            <w:tcW w:w="3774" w:type="dxa"/>
+            <w:tcW w:w="3851" w:type="dxa"/>
             <w:shd w:val="clear" w:fill="F9FBF6"/>
             <w:tcMar>
               <w:top w:w="60" w:type="dxa"/>
@@ -7462,13 +7469,13 @@
                 <w:color w:val="222222"/>
                 <w:sz w:val="18"/>
               </w:rPr>
-              <w:t xml:space="preserve">Anycast DNS, SSL termination, DDoS defense</w:t>
+              <w:t xml:space="preserve">2.9% + $0.30 per transaction</w:t>
             </w:r>
           </w:p>
         </w:tc>
         <w:tc>
           <w:tcPr>
-            <w:tcW w:w="1244" w:type="dxa"/>
+            <w:tcW w:w="1200" w:type="dxa"/>
             <w:shd w:val="clear" w:fill="F9FBF6"/>
             <w:tcMar>
               <w:top w:w="60" w:type="dxa"/>
@@ -7489,7 +7496,7 @@
                 <w:color w:val="222222"/>
                 <w:sz w:val="18"/>
               </w:rPr>
-              <w:t xml:space="preserve">$0.00</w:t>
+              <w:t xml:space="preserve">Variable</w:t>
             </w:r>
           </w:p>
         </w:tc>
@@ -7497,7 +7504,7 @@
       <w:tr>
         <w:tc>
           <w:tcPr>
-            <w:tcW w:w="2164" w:type="dxa"/>
+            <w:tcW w:w="2176" w:type="dxa"/>
             <w:tcMar>
               <w:top w:w="60" w:type="dxa"/>
               <w:bottom w:w="60" w:type="dxa"/>
@@ -7548,7 +7555,7 @@
         </w:tc>
         <w:tc>
           <w:tcPr>
-            <w:tcW w:w="1554" w:type="dxa"/>
+            <w:tcW w:w="1674" w:type="dxa"/>
             <w:tcMar>
               <w:top w:w="60" w:type="dxa"/>
               <w:bottom w:w="60" w:type="dxa"/>
@@ -7573,7 +7580,7 @@
         </w:tc>
         <w:tc>
           <w:tcPr>
-            <w:tcW w:w="3774" w:type="dxa"/>
+            <w:tcW w:w="3851" w:type="dxa"/>
             <w:tcMar>
               <w:top w:w="60" w:type="dxa"/>
               <w:bottom w:w="60" w:type="dxa"/>
@@ -7593,13 +7600,13 @@
                 <w:color w:val="222222"/>
                 <w:sz w:val="18"/>
               </w:rPr>
-              <w:t xml:space="preserve">Commercial Production Cloud Budget (10 Tenants)</w:t>
+              <w:t xml:space="preserve">Commercial Production Cloud Baseline (10–25 Tenants)</w:t>
             </w:r>
           </w:p>
         </w:tc>
         <w:tc>
           <w:tcPr>
-            <w:tcW w:w="1244" w:type="dxa"/>
+            <w:tcW w:w="1200" w:type="dxa"/>
             <w:tcMar>
               <w:top w:w="60" w:type="dxa"/>
               <w:bottom w:w="60" w:type="dxa"/>
@@ -7619,7 +7626,7 @@
                 <w:color w:val="222222"/>
                 <w:sz w:val="18"/>
               </w:rPr>
-              <w:t xml:space="preserve">~$60.00 / mo</w:t>
+              <w:t xml:space="preserve">~$61.00 / mo</w:t>
             </w:r>
           </w:p>
         </w:tc>
@@ -7644,7 +7651,7 @@
           <w:color w:val="2B4C1A"/>
           <w:sz w:val="22"/>
         </w:rPr>
-        <w:t xml:space="preserve">8.3 Commercial SaaS Subscription Pricing Model</w:t>
+        <w:t xml:space="preserve">8.3 Commercial SaaS Subscription Pricing Model (Validation Hypotheses)</w:t>
       </w:r>
     </w:p>
     <w:p xmlns:w="http://schemas.openxmlformats.org/wordprocessingml/2006/main">
@@ -7734,7 +7741,7 @@
                 <w:color w:val="1B2A1E"/>
                 <w:sz w:val="19"/>
               </w:rPr>
-              <w:t xml:space="preserve">Monthly Price</w:t>
+              <w:t xml:space="preserve">Proposed Price</w:t>
             </w:r>
           </w:p>
         </w:tc>
@@ -7761,7 +7768,7 @@
                 <w:color w:val="1B2A1E"/>
                 <w:sz w:val="19"/>
               </w:rPr>
-              <w:t xml:space="preserve">Target Customer Segment</w:t>
+              <w:t xml:space="preserve">Target Customer Hypothesis</w:t>
             </w:r>
           </w:p>
         </w:tc>
@@ -7867,7 +7874,7 @@
                 <w:color w:val="222222"/>
                 <w:sz w:val="18"/>
               </w:rPr>
-              <w:t xml:space="preserve">Seed startups &amp; small engineering teams (5–15 devs)</w:t>
+              <w:t xml:space="preserve">Seed startups &amp; small engineering teams (5–15 devs) needing structured intake</w:t>
             </w:r>
           </w:p>
         </w:tc>
@@ -7892,7 +7899,7 @@
                 <w:color w:val="222222"/>
                 <w:sz w:val="18"/>
               </w:rPr>
-              <w:t xml:space="preserve">1 active disclosure program, 3 defender seats, 10 GB encrypted storage, browser PGP crypto, RFC 9116 generator, GitHub commit verification, standard email alerts.</w:t>
+              <w:t xml:space="preserve">1 active disclosure program, 3 defender seats (all with independent program-scoped decryption capability), 10 GB encrypted storage, browser OpenPGP crypto, RFC 9116 generator, GitHub commit verification, minimal-metadata email alerts, basic Redacted PDF/JSON Closure Evidence exports.</w:t>
             </w:r>
           </w:p>
         </w:tc>
@@ -7974,7 +7981,7 @@
                 <w:color w:val="222222"/>
                 <w:sz w:val="18"/>
               </w:rPr>
-              <w:t xml:space="preserve">Growing SaaS companies (15–50 devs)</w:t>
+              <w:t xml:space="preserve">Growing SaaS companies (15–50 devs) handling multi-product disclosure</w:t>
             </w:r>
           </w:p>
         </w:tc>
@@ -8000,7 +8007,7 @@
                 <w:color w:val="222222"/>
                 <w:sz w:val="18"/>
               </w:rPr>
-              <w:t xml:space="preserve">Up to 5 programs (public &amp; private), 10 defender seats, 50 GB encrypted storage, GitHub App integration, SLA timers &amp; automated reminders, Redacted PDF Closure exports, priority support.</w:t>
+              <w:t xml:space="preserve">Up to 5 programs (public &amp; private), 10 defender seats, 50 GB encrypted storage, GitHub App integration, SLA timers &amp; automated reminders, custom-branded closure exports, executive compliance summaries, priority support.</w:t>
             </w:r>
           </w:p>
         </w:tc>
@@ -8024,7 +8031,7 @@
           <w:color w:val="222222"/>
           <w:sz w:val="20"/>
         </w:rPr>
-        <w:t xml:space="preserve">With just 2 paying customers on the Starter Tier (98/mo), the platform covers 100% of its commercial cloud operating expenses (60/mo).</w:t>
+        <w:t xml:space="preserve">With 2 paying customers on the Starter Tier (94.56 net after Stripe 2.9% + 0.30 processing fees), the platform covers 100% of its base commercial cloud operating expenses ($61.00/mo). All pricing figures represent initial validation hypotheses subject to empirical testing during the commercial pilot.</w:t>
       </w:r>
     </w:p>
     <w:p xmlns:w="http://schemas.openxmlformats.org/wordprocessingml/2006/main">

</xml_diff>